<commit_message>
Se añado la primera parte y manejo de fotos
</commit_message>
<xml_diff>
--- a/Bien_Economico_Aluminio_Argentina.docx
+++ b/Bien_Economico_Aluminio_Argentina.docx
@@ -8,6 +8,9 @@
         <w:jc w:val="center"/>
       </w:pPr>
       <w:r>
+        <w:rPr>
+          <w:noProof/>
+        </w:rPr>
         <w:drawing>
           <wp:inline distT="0" distB="0" distL="0" distR="0" wp14:anchorId="6A58AEDA" wp14:editId="038DB36C">
             <wp:extent cx="2133600" cy="646430"/>
@@ -136,16 +139,7 @@
           <w:sz w:val="56"/>
           <w:szCs w:val="52"/>
         </w:rPr>
-        <w:t>Número de Trabajo Práctico:</w:t>
-      </w:r>
-      <w:r>
-        <w:rPr>
-          <w:b/>
-          <w:color w:val="1B4965"/>
-          <w:sz w:val="56"/>
-          <w:szCs w:val="52"/>
-        </w:rPr>
-        <w:t xml:space="preserve"> 1</w:t>
+        <w:t>Número de Trabajo Práctico: 1</w:t>
       </w:r>
     </w:p>
     <w:p>
@@ -164,16 +158,7 @@
           <w:sz w:val="56"/>
           <w:szCs w:val="52"/>
         </w:rPr>
-        <w:t>Comisión:</w:t>
-      </w:r>
-      <w:r>
-        <w:rPr>
-          <w:b/>
-          <w:color w:val="1B4965"/>
-          <w:sz w:val="56"/>
-          <w:szCs w:val="52"/>
-        </w:rPr>
-        <w:t xml:space="preserve"> 301</w:t>
+        <w:t>Comisión: 301</w:t>
       </w:r>
     </w:p>
     <w:p>
@@ -192,16 +177,7 @@
           <w:sz w:val="56"/>
           <w:szCs w:val="52"/>
         </w:rPr>
-        <w:t>Fecha:</w:t>
-      </w:r>
-      <w:r>
-        <w:rPr>
-          <w:b/>
-          <w:color w:val="1B4965"/>
-          <w:sz w:val="56"/>
-          <w:szCs w:val="52"/>
-        </w:rPr>
-        <w:t xml:space="preserve"> 28/08/26</w:t>
+        <w:t>Fecha: 28/08/26</w:t>
       </w:r>
     </w:p>
     <w:p>
@@ -276,13 +252,6 @@
     </w:p>
     <w:sdt>
       <w:sdtPr>
-        <w:id w:val="980895700"/>
-        <w:docPartObj>
-          <w:docPartGallery w:val="Table of Contents"/>
-          <w:docPartUnique/>
-        </w:docPartObj>
-      </w:sdtPr>
-      <w:sdtEndPr>
         <w:rPr>
           <w:rFonts w:ascii="Calibri" w:eastAsiaTheme="minorEastAsia" w:hAnsi="Calibri" w:cstheme="minorBidi"/>
           <w:b w:val="0"/>
@@ -291,7 +260,12 @@
           <w:sz w:val="22"/>
           <w:szCs w:val="22"/>
         </w:rPr>
-      </w:sdtEndPr>
+        <w:id w:val="980895700"/>
+        <w:docPartObj>
+          <w:docPartGallery w:val="Table of Contents"/>
+          <w:docPartUnique/>
+        </w:docPartObj>
+      </w:sdtPr>
       <w:sdtContent>
         <w:p>
           <w:pPr>
@@ -438,17 +412,7 @@
               <w:sz w:val="26"/>
               <w:lang w:val="es-ES"/>
             </w:rPr>
-            <w:t>Breve Definición del Bien</w:t>
-          </w:r>
-          <w:r>
-            <w:rPr>
-              <w:rFonts w:ascii="Calibri" w:hAnsi="Calibri"/>
-              <w:b/>
-              <w:color w:val="1B4965"/>
-              <w:sz w:val="26"/>
-              <w:lang w:val="es-ES"/>
-            </w:rPr>
-            <w:t xml:space="preserve"> </w:t>
+            <w:t xml:space="preserve">Breve Definición del Bien </w:t>
           </w:r>
           <w:r>
             <w:rPr>
@@ -741,10 +705,260 @@
     </w:p>
     <w:p>
       <w:pPr>
-        <w:spacing w:after="120"/>
+        <w:rPr>
+          <w:lang w:val="es-AR"/>
+        </w:rPr>
       </w:pPr>
       <w:r>
-        <w:t>El bien económico seleccionado es el Aluminio (Al), clasificado como un metal no ferroso de uso industrial generalizado y alto valor estratégico.</w:t>
+        <w:rPr>
+          <w:noProof/>
+          <w:lang w:val="es-AR"/>
+        </w:rPr>
+        <w:drawing>
+          <wp:anchor distT="0" distB="0" distL="114300" distR="114300" simplePos="0" relativeHeight="251651584" behindDoc="1" locked="0" layoutInCell="1" allowOverlap="1" wp14:anchorId="682EE3C1" wp14:editId="612CC326">
+            <wp:simplePos x="0" y="0"/>
+            <wp:positionH relativeFrom="column">
+              <wp:posOffset>3124200</wp:posOffset>
+            </wp:positionH>
+            <wp:positionV relativeFrom="paragraph">
+              <wp:posOffset>117475</wp:posOffset>
+            </wp:positionV>
+            <wp:extent cx="2700000" cy="2880000"/>
+            <wp:effectExtent l="133350" t="114300" r="120015" b="149225"/>
+            <wp:wrapTight wrapText="bothSides">
+              <wp:wrapPolygon edited="0">
+                <wp:start x="-305" y="-857"/>
+                <wp:lineTo x="-1067" y="-572"/>
+                <wp:lineTo x="-1067" y="21290"/>
+                <wp:lineTo x="-457" y="22291"/>
+                <wp:lineTo x="-457" y="22576"/>
+                <wp:lineTo x="22103" y="22576"/>
+                <wp:lineTo x="22408" y="20004"/>
+                <wp:lineTo x="22408" y="1715"/>
+                <wp:lineTo x="21798" y="-429"/>
+                <wp:lineTo x="21798" y="-857"/>
+                <wp:lineTo x="-305" y="-857"/>
+              </wp:wrapPolygon>
+            </wp:wrapTight>
+            <wp:docPr id="2125558418" name="Imagen 2"/>
+            <wp:cNvGraphicFramePr>
+              <a:graphicFrameLocks xmlns:a="http://schemas.openxmlformats.org/drawingml/2006/main"/>
+            </wp:cNvGraphicFramePr>
+            <a:graphic xmlns:a="http://schemas.openxmlformats.org/drawingml/2006/main">
+              <a:graphicData uri="http://schemas.openxmlformats.org/drawingml/2006/picture">
+                <pic:pic xmlns:pic="http://schemas.openxmlformats.org/drawingml/2006/picture">
+                  <pic:nvPicPr>
+                    <pic:cNvPr id="2125558418" name="Imagen 2"/>
+                    <pic:cNvPicPr preferRelativeResize="0">
+                      <a:picLocks noChangeAspect="1" noChangeArrowheads="1"/>
+                    </pic:cNvPicPr>
+                  </pic:nvPicPr>
+                  <pic:blipFill>
+                    <a:blip r:embed="rId9">
+                      <a:extLst>
+                        <a:ext uri="{28A0092B-C50C-407E-A947-70E740481C1C}">
+                          <a14:useLocalDpi xmlns:a14="http://schemas.microsoft.com/office/drawing/2010/main" val="0"/>
+                        </a:ext>
+                      </a:extLst>
+                    </a:blip>
+                    <a:srcRect/>
+                    <a:stretch>
+                      <a:fillRect/>
+                    </a:stretch>
+                  </pic:blipFill>
+                  <pic:spPr bwMode="auto">
+                    <a:xfrm>
+                      <a:off x="0" y="0"/>
+                      <a:ext cx="2700000" cy="2880000"/>
+                    </a:xfrm>
+                    <a:prstGeom prst="rect">
+                      <a:avLst/>
+                    </a:prstGeom>
+                    <a:noFill/>
+                    <a:ln>
+                      <a:noFill/>
+                    </a:ln>
+                    <a:effectLst>
+                      <a:outerShdw blurRad="107950" dist="12700" dir="5400000" algn="ctr">
+                        <a:srgbClr val="000000"/>
+                      </a:outerShdw>
+                    </a:effectLst>
+                    <a:scene3d>
+                      <a:camera prst="orthographicFront">
+                        <a:rot lat="0" lon="0" rev="0"/>
+                      </a:camera>
+                      <a:lightRig rig="soft" dir="t">
+                        <a:rot lat="0" lon="0" rev="0"/>
+                      </a:lightRig>
+                    </a:scene3d>
+                    <a:sp3d contourW="44450" prstMaterial="matte">
+                      <a:bevelT w="63500" h="63500" prst="artDeco"/>
+                      <a:contourClr>
+                        <a:srgbClr val="FFFFFF"/>
+                      </a:contourClr>
+                    </a:sp3d>
+                  </pic:spPr>
+                </pic:pic>
+              </a:graphicData>
+            </a:graphic>
+            <wp14:sizeRelH relativeFrom="page">
+              <wp14:pctWidth>0</wp14:pctWidth>
+            </wp14:sizeRelH>
+            <wp14:sizeRelV relativeFrom="page">
+              <wp14:pctHeight>0</wp14:pctHeight>
+            </wp14:sizeRelV>
+          </wp:anchor>
+        </w:drawing>
+      </w:r>
+      <w:r>
+        <w:t xml:space="preserve">El bien económico elegido para este informe es el </w:t>
+      </w:r>
+      <w:r>
+        <w:rPr>
+          <w:b/>
+          <w:bCs/>
+        </w:rPr>
+        <w:t>Aluminio (Al)</w:t>
+      </w:r>
+      <w:r>
+        <w:t xml:space="preserve">. En la naturaleza no se encuentra en estado puro, sino que se origina a lo largo de millones de años por la erosión de rocas de la corteza terrestre en climas tropicales, lo que da lugar a la </w:t>
+      </w:r>
+      <w:r>
+        <w:rPr>
+          <w:b/>
+          <w:bCs/>
+        </w:rPr>
+        <w:t>bauxita</w:t>
+      </w:r>
+      <w:r>
+        <w:t xml:space="preserve"> (su roca de origen).</w:t>
+      </w:r>
+    </w:p>
+    <w:p>
+      <w:pPr>
+        <w:rPr>
+          <w:lang w:val="es-AR"/>
+        </w:rPr>
+      </w:pPr>
+      <w:r>
+        <w:rPr>
+          <w:noProof/>
+          <w:lang w:val="es-AR"/>
+        </w:rPr>
+        <w:drawing>
+          <wp:anchor distT="0" distB="0" distL="114300" distR="114300" simplePos="0" relativeHeight="251672064" behindDoc="1" locked="0" layoutInCell="1" allowOverlap="1" wp14:anchorId="79C7E615" wp14:editId="3C4696F7">
+            <wp:simplePos x="0" y="0"/>
+            <wp:positionH relativeFrom="column">
+              <wp:posOffset>66675</wp:posOffset>
+            </wp:positionH>
+            <wp:positionV relativeFrom="paragraph">
+              <wp:posOffset>2075815</wp:posOffset>
+            </wp:positionV>
+            <wp:extent cx="5823585" cy="3105150"/>
+            <wp:effectExtent l="114300" t="133350" r="120015" b="152400"/>
+            <wp:wrapTight wrapText="bothSides">
+              <wp:wrapPolygon edited="0">
+                <wp:start x="-71" y="-928"/>
+                <wp:lineTo x="-424" y="-663"/>
+                <wp:lineTo x="-424" y="21335"/>
+                <wp:lineTo x="-212" y="22528"/>
+                <wp:lineTo x="21763" y="22528"/>
+                <wp:lineTo x="21974" y="20672"/>
+                <wp:lineTo x="21974" y="1458"/>
+                <wp:lineTo x="21551" y="-530"/>
+                <wp:lineTo x="21551" y="-928"/>
+                <wp:lineTo x="-71" y="-928"/>
+              </wp:wrapPolygon>
+            </wp:wrapTight>
+            <wp:docPr id="536378252" name="Imagen 5"/>
+            <wp:cNvGraphicFramePr>
+              <a:graphicFrameLocks xmlns:a="http://schemas.openxmlformats.org/drawingml/2006/main"/>
+            </wp:cNvGraphicFramePr>
+            <a:graphic xmlns:a="http://schemas.openxmlformats.org/drawingml/2006/main">
+              <a:graphicData uri="http://schemas.openxmlformats.org/drawingml/2006/picture">
+                <pic:pic xmlns:pic="http://schemas.openxmlformats.org/drawingml/2006/picture">
+                  <pic:nvPicPr>
+                    <pic:cNvPr id="0" name="Picture 4"/>
+                    <pic:cNvPicPr preferRelativeResize="0">
+                      <a:picLocks noChangeAspect="1" noChangeArrowheads="1"/>
+                    </pic:cNvPicPr>
+                  </pic:nvPicPr>
+                  <pic:blipFill>
+                    <a:blip r:embed="rId10">
+                      <a:extLst>
+                        <a:ext uri="{28A0092B-C50C-407E-A947-70E740481C1C}">
+                          <a14:useLocalDpi xmlns:a14="http://schemas.microsoft.com/office/drawing/2010/main" val="0"/>
+                        </a:ext>
+                      </a:extLst>
+                    </a:blip>
+                    <a:srcRect/>
+                    <a:stretch>
+                      <a:fillRect/>
+                    </a:stretch>
+                  </pic:blipFill>
+                  <pic:spPr bwMode="auto">
+                    <a:xfrm>
+                      <a:off x="0" y="0"/>
+                      <a:ext cx="5823585" cy="3105150"/>
+                    </a:xfrm>
+                    <a:prstGeom prst="rect">
+                      <a:avLst/>
+                    </a:prstGeom>
+                    <a:noFill/>
+                    <a:ln>
+                      <a:noFill/>
+                    </a:ln>
+                    <a:effectLst>
+                      <a:outerShdw blurRad="107950" dist="12700" dir="5400000" algn="ctr">
+                        <a:srgbClr val="000000"/>
+                      </a:outerShdw>
+                    </a:effectLst>
+                    <a:scene3d>
+                      <a:camera prst="orthographicFront">
+                        <a:rot lat="0" lon="0" rev="0"/>
+                      </a:camera>
+                      <a:lightRig rig="soft" dir="t">
+                        <a:rot lat="0" lon="0" rev="0"/>
+                      </a:lightRig>
+                    </a:scene3d>
+                    <a:sp3d contourW="44450" prstMaterial="matte">
+                      <a:bevelT w="63500" h="63500" prst="artDeco"/>
+                      <a:contourClr>
+                        <a:srgbClr val="FFFFFF"/>
+                      </a:contourClr>
+                    </a:sp3d>
+                  </pic:spPr>
+                </pic:pic>
+              </a:graphicData>
+            </a:graphic>
+            <wp14:sizeRelH relativeFrom="margin">
+              <wp14:pctWidth>0</wp14:pctWidth>
+            </wp14:sizeRelH>
+            <wp14:sizeRelV relativeFrom="margin">
+              <wp14:pctHeight>0</wp14:pctHeight>
+            </wp14:sizeRelV>
+          </wp:anchor>
+        </w:drawing>
+      </w:r>
+      <w:r>
+        <w:rPr>
+          <w:lang w:val="es-AR"/>
+        </w:rPr>
+        <w:t xml:space="preserve">A nivel económico, se clasifica como un </w:t>
+      </w:r>
+      <w:r>
+        <w:rPr>
+          <w:b/>
+          <w:bCs/>
+          <w:lang w:val="es-AR"/>
+        </w:rPr>
+        <w:t>bien intermedio</w:t>
+      </w:r>
+      <w:r>
+        <w:rPr>
+          <w:lang w:val="es-AR"/>
+        </w:rPr>
+        <w:t>, ya que funciona como un insumo clave para múltiples cadenas productivas (como la automotriz, la construcción y el envasado). Es un metal no ferroso de alto valor estratégico, totalmente reciclable y esencial para la economía circular. En Argentina, su producción se caracteriza por ser un mercado muy concentrado y fuertemente orientado a la exportación.</w:t>
       </w:r>
     </w:p>
     <w:p>
@@ -758,6 +972,7 @@
           <w:color w:val="1B4965"/>
           <w:sz w:val="26"/>
         </w:rPr>
+        <w:lastRenderedPageBreak/>
         <w:t>2. Breve Definición del Bien</w:t>
       </w:r>
     </w:p>
@@ -825,23 +1040,7 @@
           <w:b/>
           <w:color w:val="1B4965"/>
         </w:rPr>
-        <w:t>Proceso Hall-</w:t>
-      </w:r>
-      <w:proofErr w:type="spellStart"/>
-      <w:r>
-        <w:rPr>
-          <w:b/>
-          <w:color w:val="1B4965"/>
-        </w:rPr>
-        <w:t>Héroult</w:t>
-      </w:r>
-      <w:proofErr w:type="spellEnd"/>
-      <w:r>
-        <w:rPr>
-          <w:b/>
-          <w:color w:val="1B4965"/>
-        </w:rPr>
-        <w:t xml:space="preserve">: </w:t>
+        <w:t xml:space="preserve">Proceso Hall-Héroult: </w:t>
       </w:r>
       <w:r>
         <w:t>Electrólisis de la alúmina en hornos a altas temperaturas (aprox. 950°C) con alto consumo de energía eléctrica para obtener aluminio primario. Esta es la fase industrial crítica que se realiza en Argentina.</w:t>
@@ -926,7 +1125,6 @@
           <w:color w:val="1B4965"/>
           <w:sz w:val="26"/>
         </w:rPr>
-        <w:lastRenderedPageBreak/>
         <w:t>6. Análisis del Mercado Internacional</w:t>
       </w:r>
     </w:p>
@@ -1002,6 +1200,7 @@
           <w:b/>
           <w:color w:val="1B4965"/>
         </w:rPr>
+        <w:lastRenderedPageBreak/>
         <w:t xml:space="preserve">Importaciones: </w:t>
       </w:r>
       <w:r>
@@ -1290,7 +1489,7 @@
       </w:r>
     </w:p>
     <w:sectPr>
-      <w:footerReference w:type="default" r:id="rId9"/>
+      <w:footerReference w:type="default" r:id="rId11"/>
       <w:pgSz w:w="12240" w:h="15840"/>
       <w:pgMar w:top="1440" w:right="1440" w:bottom="1440" w:left="1440" w:header="720" w:footer="720" w:gutter="0"/>
       <w:cols w:space="720"/>
@@ -1333,6 +1532,7 @@
     </w:pPr>
     <w:r>
       <w:rPr>
+        <w:noProof/>
         <w:color w:val="4F81BD" w:themeColor="accent1"/>
       </w:rPr>
       <mc:AlternateContent>
@@ -1408,7 +1608,7 @@
         </mc:Choice>
         <mc:Fallback>
           <w:pict>
-            <v:rect w14:anchorId="3EA87607" id="Rectángulo 247" o:spid="_x0000_s1026" style="position:absolute;margin-left:0;margin-top:0;width:579.9pt;height:750.3pt;z-index:251659264;visibility:visible;mso-wrap-style:square;mso-width-percent:950;mso-height-percent:950;mso-wrap-distance-left:9pt;mso-wrap-distance-top:0;mso-wrap-distance-right:9pt;mso-wrap-distance-bottom:0;mso-position-horizontal:center;mso-position-horizontal-relative:page;mso-position-vertical:center;mso-position-vertical-relative:page;mso-width-percent:950;mso-height-percent:950;mso-width-relative:page;mso-height-relative:page;v-text-anchor:middle" o:gfxdata="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" filled="f" strokecolor="#938953 [1614]" strokeweight="1.25pt">
+            <v:rect w14:anchorId="6093AB10" id="Rectángulo 247" o:spid="_x0000_s1026" style="position:absolute;margin-left:0;margin-top:0;width:579.9pt;height:750.3pt;z-index:251659264;visibility:visible;mso-wrap-style:square;mso-width-percent:950;mso-height-percent:950;mso-wrap-distance-left:9pt;mso-wrap-distance-top:0;mso-wrap-distance-right:9pt;mso-wrap-distance-bottom:0;mso-position-horizontal:center;mso-position-horizontal-relative:page;mso-position-vertical:center;mso-position-vertical-relative:page;mso-width-percent:950;mso-height-percent:950;mso-width-relative:page;mso-height-relative:page;v-text-anchor:middle" o:gfxdata="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" filled="f" strokecolor="#938953 [1614]" strokeweight="1.25pt">
               <w10:wrap anchorx="page" anchory="page"/>
             </v:rect>
           </w:pict>
@@ -2430,7 +2630,6 @@
   <w:style w:type="character" w:default="1" w:styleId="Fuentedeprrafopredeter">
     <w:name w:val="Default Paragraph Font"/>
     <w:uiPriority w:val="1"/>
-    <w:semiHidden/>
     <w:unhideWhenUsed/>
   </w:style>
   <w:style w:type="table" w:default="1" w:styleId="Tablanormal">
@@ -3000,7 +3199,6 @@
     <w:basedOn w:val="Normal"/>
     <w:next w:val="Normal"/>
     <w:uiPriority w:val="35"/>
-    <w:semiHidden/>
     <w:unhideWhenUsed/>
     <w:qFormat/>
     <w:rsid w:val="00FC693F"/>
@@ -13434,9 +13632,12 @@
   </w:compat>
   <w:rsids>
     <w:rsidRoot w:val="007A79A0"/>
+    <w:rsid w:val="00025DB8"/>
     <w:rsid w:val="00380F32"/>
     <w:rsid w:val="007A79A0"/>
+    <w:rsid w:val="00BF008C"/>
     <w:rsid w:val="00FE7612"/>
+    <w:rsid w:val="00FF20B2"/>
   </w:rsids>
   <m:mathPr>
     <m:mathFont m:val="Cambria Math"/>
@@ -13887,34 +14088,6 @@
     <w:semiHidden/>
     <w:unhideWhenUsed/>
   </w:style>
-  <w:style w:type="paragraph" w:customStyle="1" w:styleId="EE4A6E9ED36D44CC90922EC4917A45AE">
-    <w:name w:val="EE4A6E9ED36D44CC90922EC4917A45AE"/>
-    <w:rsid w:val="007A79A0"/>
-  </w:style>
-  <w:style w:type="paragraph" w:customStyle="1" w:styleId="FBAFF97B53504C49BF9CF4E9AAAFABE4">
-    <w:name w:val="FBAFF97B53504C49BF9CF4E9AAAFABE4"/>
-    <w:rsid w:val="007A79A0"/>
-  </w:style>
-  <w:style w:type="paragraph" w:customStyle="1" w:styleId="9E7A005A57A74BD195F82F449A9C4D32">
-    <w:name w:val="9E7A005A57A74BD195F82F449A9C4D32"/>
-    <w:rsid w:val="007A79A0"/>
-  </w:style>
-  <w:style w:type="paragraph" w:customStyle="1" w:styleId="B33873CF07F04A7992116BAD44FBC793">
-    <w:name w:val="B33873CF07F04A7992116BAD44FBC793"/>
-    <w:rsid w:val="007A79A0"/>
-  </w:style>
-  <w:style w:type="paragraph" w:customStyle="1" w:styleId="30B5F48CCADC4DF988E13BAD273E761F">
-    <w:name w:val="30B5F48CCADC4DF988E13BAD273E761F"/>
-    <w:rsid w:val="007A79A0"/>
-  </w:style>
-  <w:style w:type="paragraph" w:customStyle="1" w:styleId="E63724BC3B0B4B5F863C69E01CA8D676">
-    <w:name w:val="E63724BC3B0B4B5F863C69E01CA8D676"/>
-    <w:rsid w:val="007A79A0"/>
-  </w:style>
-  <w:style w:type="paragraph" w:customStyle="1" w:styleId="364F5C076F0F4777A689EE4706C23DDC">
-    <w:name w:val="364F5C076F0F4777A689EE4706C23DDC"/>
-    <w:rsid w:val="007A79A0"/>
-  </w:style>
   <w:style w:type="paragraph" w:customStyle="1" w:styleId="6394AE655C304D0DA7EA8C6C874A8197">
     <w:name w:val="6394AE655C304D0DA7EA8C6C874A8197"/>
     <w:rsid w:val="007A79A0"/>

</xml_diff>

<commit_message>
Segundo paso caracteristicas del aluminio
</commit_message>
<xml_diff>
--- a/Bien_Economico_Aluminio_Argentina.docx
+++ b/Bien_Economico_Aluminio_Argentina.docx
@@ -715,7 +715,7 @@
           <w:lang w:val="es-AR"/>
         </w:rPr>
         <w:drawing>
-          <wp:anchor distT="0" distB="0" distL="114300" distR="114300" simplePos="0" relativeHeight="251651584" behindDoc="1" locked="0" layoutInCell="1" allowOverlap="1" wp14:anchorId="682EE3C1" wp14:editId="612CC326">
+          <wp:anchor distT="0" distB="0" distL="114300" distR="114300" simplePos="0" relativeHeight="251650560" behindDoc="1" locked="0" layoutInCell="1" allowOverlap="1" wp14:anchorId="682EE3C1" wp14:editId="612CC326">
             <wp:simplePos x="0" y="0"/>
             <wp:positionH relativeFrom="column">
               <wp:posOffset>3124200</wp:posOffset>
@@ -846,7 +846,7 @@
           <w:lang w:val="es-AR"/>
         </w:rPr>
         <w:drawing>
-          <wp:anchor distT="0" distB="0" distL="114300" distR="114300" simplePos="0" relativeHeight="251672064" behindDoc="1" locked="0" layoutInCell="1" allowOverlap="1" wp14:anchorId="79C7E615" wp14:editId="3C4696F7">
+          <wp:anchor distT="0" distB="0" distL="114300" distR="114300" simplePos="0" relativeHeight="251671040" behindDoc="1" locked="0" layoutInCell="1" allowOverlap="1" wp14:anchorId="79C7E615" wp14:editId="3C4696F7">
             <wp:simplePos x="0" y="0"/>
             <wp:positionH relativeFrom="column">
               <wp:posOffset>66675</wp:posOffset>
@@ -981,8 +981,574 @@
         <w:spacing w:after="120"/>
       </w:pPr>
       <w:r>
-        <w:t>El aluminio es un metal ligero, no magnético, altamente resistente a la corrosión y con excelente conductividad eléctrica y térmica. Además, es un material 100% reciclable. Sus características lo hacen fundamental en industrias clave como la automotriz, construcción, envases, aeronáutica y la transmisión de energía.</w:t>
+        <w:t xml:space="preserve">El aluminio </w:t>
       </w:r>
+      <w:r>
+        <w:t xml:space="preserve">tiene características como </w:t>
+      </w:r>
+    </w:p>
+    <w:p>
+      <w:pPr>
+        <w:pStyle w:val="Prrafodelista"/>
+        <w:numPr>
+          <w:ilvl w:val="0"/>
+          <w:numId w:val="11"/>
+        </w:numPr>
+        <w:spacing w:after="120"/>
+      </w:pPr>
+      <w:r>
+        <w:t xml:space="preserve">Abundancia: </w:t>
+      </w:r>
+      <w:r>
+        <w:t xml:space="preserve">Es el metal más abundante ya que constituye alrededor del </w:t>
+      </w:r>
+      <w:r>
+        <w:rPr>
+          <w:b/>
+          <w:bCs/>
+        </w:rPr>
+        <w:t>8%</w:t>
+      </w:r>
+      <w:r>
+        <w:t xml:space="preserve"> de la corteza de nuestro planeta.</w:t>
+      </w:r>
+    </w:p>
+    <w:p>
+      <w:pPr>
+        <w:pStyle w:val="Prrafodelista"/>
+        <w:numPr>
+          <w:ilvl w:val="0"/>
+          <w:numId w:val="11"/>
+        </w:numPr>
+        <w:spacing w:after="120"/>
+      </w:pPr>
+      <w:r>
+        <w:t>M</w:t>
+      </w:r>
+      <w:r>
+        <w:t>etal ligero</w:t>
+      </w:r>
+      <w:r>
+        <w:t>:</w:t>
+      </w:r>
+    </w:p>
+    <w:p>
+      <w:pPr>
+        <w:pStyle w:val="Prrafodelista"/>
+        <w:numPr>
+          <w:ilvl w:val="0"/>
+          <w:numId w:val="11"/>
+        </w:numPr>
+        <w:spacing w:after="120"/>
+      </w:pPr>
+    </w:p>
+    <w:tbl>
+      <w:tblPr>
+        <w:tblW w:w="0" w:type="auto"/>
+        <w:jc w:val="center"/>
+        <w:tblLook w:val="04A0" w:firstRow="1" w:lastRow="0" w:firstColumn="1" w:lastColumn="0" w:noHBand="0" w:noVBand="1"/>
+      </w:tblPr>
+      <w:tblGrid>
+        <w:gridCol w:w="2160"/>
+        <w:gridCol w:w="2821"/>
+      </w:tblGrid>
+      <w:tr>
+        <w:trPr>
+          <w:jc w:val="center"/>
+        </w:trPr>
+        <w:tc>
+          <w:tcPr>
+            <w:tcW w:w="2160" w:type="dxa"/>
+            <w:shd w:val="clear" w:color="auto" w:fill="1B4965"/>
+          </w:tcPr>
+          <w:p>
+            <w:pPr>
+              <w:jc w:val="center"/>
+            </w:pPr>
+            <w:r>
+              <w:rPr>
+                <w:b/>
+                <w:color w:val="FFFFFF"/>
+              </w:rPr>
+              <w:t>Metal</w:t>
+            </w:r>
+          </w:p>
+        </w:tc>
+        <w:tc>
+          <w:tcPr>
+            <w:tcW w:w="2821" w:type="dxa"/>
+            <w:shd w:val="clear" w:color="auto" w:fill="1B4965"/>
+          </w:tcPr>
+          <w:p>
+            <w:pPr>
+              <w:jc w:val="center"/>
+              <w:rPr>
+                <w:b/>
+                <w:color w:val="FFFFFF"/>
+              </w:rPr>
+            </w:pPr>
+            <w:r>
+              <w:rPr>
+                <w:b/>
+                <w:color w:val="FFFFFF"/>
+              </w:rPr>
+              <w:t>Densidad (g/cm³)</w:t>
+            </w:r>
+          </w:p>
+        </w:tc>
+      </w:tr>
+      <w:tr>
+        <w:trPr>
+          <w:jc w:val="center"/>
+        </w:trPr>
+        <w:tc>
+          <w:tcPr>
+            <w:tcW w:w="2160" w:type="dxa"/>
+            <w:shd w:val="clear" w:color="auto" w:fill="FFFFFF"/>
+          </w:tcPr>
+          <w:p>
+            <w:r>
+              <w:rPr>
+                <w:b/>
+              </w:rPr>
+              <w:t>Aluminio (puro)</w:t>
+            </w:r>
+          </w:p>
+        </w:tc>
+        <w:tc>
+          <w:tcPr>
+            <w:tcW w:w="2821" w:type="dxa"/>
+            <w:shd w:val="clear" w:color="auto" w:fill="FFFFFF"/>
+          </w:tcPr>
+          <w:p>
+            <w:pPr>
+              <w:jc w:val="center"/>
+            </w:pPr>
+            <w:r>
+              <w:t>2,7 g/cm³</w:t>
+            </w:r>
+          </w:p>
+        </w:tc>
+      </w:tr>
+      <w:tr>
+        <w:trPr>
+          <w:jc w:val="center"/>
+        </w:trPr>
+        <w:tc>
+          <w:tcPr>
+            <w:tcW w:w="2160" w:type="dxa"/>
+            <w:shd w:val="clear" w:color="auto" w:fill="F8FAFC"/>
+          </w:tcPr>
+          <w:p>
+            <w:r>
+              <w:rPr>
+                <w:b/>
+              </w:rPr>
+              <w:t>Hierro (puro)</w:t>
+            </w:r>
+          </w:p>
+        </w:tc>
+        <w:tc>
+          <w:tcPr>
+            <w:tcW w:w="2821" w:type="dxa"/>
+            <w:shd w:val="clear" w:color="auto" w:fill="F8FAFC"/>
+          </w:tcPr>
+          <w:p>
+            <w:pPr>
+              <w:jc w:val="center"/>
+            </w:pPr>
+            <w:r>
+              <w:t>7,8 g/cm³</w:t>
+            </w:r>
+          </w:p>
+        </w:tc>
+      </w:tr>
+      <w:tr>
+        <w:trPr>
+          <w:jc w:val="center"/>
+        </w:trPr>
+        <w:tc>
+          <w:tcPr>
+            <w:tcW w:w="2160" w:type="dxa"/>
+            <w:shd w:val="clear" w:color="auto" w:fill="FFFFFF"/>
+          </w:tcPr>
+          <w:p>
+            <w:r>
+              <w:t>Cobre</w:t>
+            </w:r>
+          </w:p>
+        </w:tc>
+        <w:tc>
+          <w:tcPr>
+            <w:tcW w:w="2821" w:type="dxa"/>
+            <w:shd w:val="clear" w:color="auto" w:fill="FFFFFF"/>
+          </w:tcPr>
+          <w:p>
+            <w:pPr>
+              <w:jc w:val="center"/>
+              <w:rPr>
+                <w:u w:val="single"/>
+              </w:rPr>
+            </w:pPr>
+            <w:r>
+              <w:t>8,9 g/cm³</w:t>
+            </w:r>
+          </w:p>
+        </w:tc>
+      </w:tr>
+    </w:tbl>
+    <w:p>
+      <w:pPr>
+        <w:spacing w:after="120"/>
+      </w:pPr>
+    </w:p>
+    <w:p>
+      <w:pPr>
+        <w:pStyle w:val="Prrafodelista"/>
+        <w:numPr>
+          <w:ilvl w:val="0"/>
+          <w:numId w:val="11"/>
+        </w:numPr>
+        <w:spacing w:after="120"/>
+      </w:pPr>
+      <w:r>
+        <w:t>N</w:t>
+      </w:r>
+      <w:r>
+        <w:t>o magnético</w:t>
+      </w:r>
+      <w:r>
+        <w:t>:</w:t>
+      </w:r>
+      <w:r>
+        <w:t xml:space="preserve"> E</w:t>
+      </w:r>
+      <w:r>
+        <w:t xml:space="preserve">s un material </w:t>
+      </w:r>
+      <w:r>
+        <w:rPr>
+          <w:b/>
+          <w:bCs/>
+        </w:rPr>
+        <w:t>paramagnético (</w:t>
+      </w:r>
+      <w:r>
+        <w:rPr>
+          <w:b/>
+          <w:bCs/>
+        </w:rPr>
+        <w:t>se magnetizan de forma muy débil a favor del campo)</w:t>
+      </w:r>
+      <w:r>
+        <w:t>.</w:t>
+      </w:r>
+    </w:p>
+    <w:p>
+      <w:pPr>
+        <w:pStyle w:val="Prrafodelista"/>
+        <w:numPr>
+          <w:ilvl w:val="0"/>
+          <w:numId w:val="11"/>
+        </w:numPr>
+        <w:spacing w:after="120"/>
+      </w:pPr>
+      <w:r>
+        <w:t>A</w:t>
+      </w:r>
+      <w:r>
+        <w:t>ltamente resistente a la corrosión</w:t>
+      </w:r>
+      <w:r>
+        <w:t xml:space="preserve">: </w:t>
+      </w:r>
+      <w:r>
+        <w:t>forma una capa de óxido que protege la superficie de una mayor oxidación</w:t>
+      </w:r>
+    </w:p>
+    <w:p>
+      <w:pPr>
+        <w:pStyle w:val="Prrafodelista"/>
+        <w:numPr>
+          <w:ilvl w:val="0"/>
+          <w:numId w:val="11"/>
+        </w:numPr>
+        <w:spacing w:after="120"/>
+      </w:pPr>
+      <w:r>
+        <w:t>E</w:t>
+      </w:r>
+      <w:r>
+        <w:t>xcelente conductividad eléctrica y térmica</w:t>
+      </w:r>
+      <w:r>
+        <w:t>:</w:t>
+      </w:r>
+      <w:r>
+        <w:t xml:space="preserve"> </w:t>
+      </w:r>
+      <w:r>
+        <w:t xml:space="preserve">Comparado con el cobre, el aluminio alcanza aproximadamente un </w:t>
+      </w:r>
+      <w:r>
+        <w:rPr>
+          <w:b/>
+          <w:bCs/>
+        </w:rPr>
+        <w:t>62%</w:t>
+      </w:r>
+      <w:r>
+        <w:t xml:space="preserve"> de su conductividad eléctrica según la norma IACS y entre un </w:t>
+      </w:r>
+      <w:r>
+        <w:rPr>
+          <w:b/>
+          <w:bCs/>
+        </w:rPr>
+        <w:t>50% y 60%</w:t>
+      </w:r>
+      <w:r>
+        <w:t xml:space="preserve"> de su conductividad térmica.</w:t>
+      </w:r>
+    </w:p>
+    <w:p>
+      <w:pPr>
+        <w:pStyle w:val="Prrafodelista"/>
+        <w:numPr>
+          <w:ilvl w:val="0"/>
+          <w:numId w:val="11"/>
+        </w:numPr>
+        <w:spacing w:after="120"/>
+      </w:pPr>
+      <w:r>
+        <w:t>E</w:t>
+      </w:r>
+      <w:r>
+        <w:t>s un material 100% reciclable.</w:t>
+      </w:r>
+    </w:p>
+    <w:p>
+      <w:pPr>
+        <w:pStyle w:val="Prrafodelista"/>
+        <w:numPr>
+          <w:ilvl w:val="0"/>
+          <w:numId w:val="11"/>
+        </w:numPr>
+        <w:spacing w:after="120"/>
+      </w:pPr>
+      <w:r>
+        <w:t>Facilidad de fabricación</w:t>
+      </w:r>
+      <w:r>
+        <w:t>.</w:t>
+      </w:r>
+    </w:p>
+    <w:p>
+      <w:pPr>
+        <w:pStyle w:val="Prrafodelista"/>
+        <w:numPr>
+          <w:ilvl w:val="0"/>
+          <w:numId w:val="11"/>
+        </w:numPr>
+        <w:spacing w:after="120"/>
+      </w:pPr>
+      <w:r>
+        <w:t>Alta relación peso/resistencia</w:t>
+      </w:r>
+    </w:p>
+    <w:p>
+      <w:pPr>
+        <w:pStyle w:val="Prrafodelista"/>
+        <w:numPr>
+          <w:ilvl w:val="0"/>
+          <w:numId w:val="11"/>
+        </w:numPr>
+        <w:spacing w:after="120"/>
+      </w:pPr>
+      <w:r>
+        <w:t>Baja temperatura de fusión:</w:t>
+      </w:r>
+    </w:p>
+    <w:tbl>
+      <w:tblPr>
+        <w:tblW w:w="0" w:type="auto"/>
+        <w:jc w:val="center"/>
+        <w:tblLook w:val="04A0" w:firstRow="1" w:lastRow="0" w:firstColumn="1" w:lastColumn="0" w:noHBand="0" w:noVBand="1"/>
+      </w:tblPr>
+      <w:tblGrid>
+        <w:gridCol w:w="2160"/>
+        <w:gridCol w:w="2821"/>
+      </w:tblGrid>
+      <w:tr>
+        <w:trPr>
+          <w:jc w:val="center"/>
+        </w:trPr>
+        <w:tc>
+          <w:tcPr>
+            <w:tcW w:w="2160" w:type="dxa"/>
+            <w:shd w:val="clear" w:color="auto" w:fill="1B4965"/>
+          </w:tcPr>
+          <w:p>
+            <w:pPr>
+              <w:jc w:val="center"/>
+            </w:pPr>
+            <w:r>
+              <w:rPr>
+                <w:b/>
+                <w:color w:val="FFFFFF"/>
+              </w:rPr>
+              <w:t>Metal</w:t>
+            </w:r>
+          </w:p>
+        </w:tc>
+        <w:tc>
+          <w:tcPr>
+            <w:tcW w:w="2821" w:type="dxa"/>
+            <w:shd w:val="clear" w:color="auto" w:fill="1B4965"/>
+          </w:tcPr>
+          <w:p>
+            <w:pPr>
+              <w:jc w:val="center"/>
+            </w:pPr>
+            <w:r>
+              <w:rPr>
+                <w:b/>
+                <w:color w:val="FFFFFF"/>
+              </w:rPr>
+              <w:t>Punto de fusión (°C)</w:t>
+            </w:r>
+          </w:p>
+        </w:tc>
+      </w:tr>
+      <w:tr>
+        <w:trPr>
+          <w:jc w:val="center"/>
+        </w:trPr>
+        <w:tc>
+          <w:tcPr>
+            <w:tcW w:w="2160" w:type="dxa"/>
+            <w:shd w:val="clear" w:color="auto" w:fill="FFFFFF"/>
+          </w:tcPr>
+          <w:p>
+            <w:r>
+              <w:rPr>
+                <w:b/>
+              </w:rPr>
+              <w:t>Aluminio (puro)</w:t>
+            </w:r>
+          </w:p>
+        </w:tc>
+        <w:tc>
+          <w:tcPr>
+            <w:tcW w:w="2821" w:type="dxa"/>
+            <w:shd w:val="clear" w:color="auto" w:fill="FFFFFF"/>
+          </w:tcPr>
+          <w:p>
+            <w:pPr>
+              <w:jc w:val="center"/>
+            </w:pPr>
+            <w:r>
+              <w:t>660 °C</w:t>
+            </w:r>
+          </w:p>
+        </w:tc>
+      </w:tr>
+      <w:tr>
+        <w:trPr>
+          <w:jc w:val="center"/>
+        </w:trPr>
+        <w:tc>
+          <w:tcPr>
+            <w:tcW w:w="2160" w:type="dxa"/>
+            <w:shd w:val="clear" w:color="auto" w:fill="F8FAFC"/>
+          </w:tcPr>
+          <w:p>
+            <w:r>
+              <w:rPr>
+                <w:b/>
+              </w:rPr>
+              <w:t>Cobre</w:t>
+            </w:r>
+          </w:p>
+        </w:tc>
+        <w:tc>
+          <w:tcPr>
+            <w:tcW w:w="2821" w:type="dxa"/>
+            <w:shd w:val="clear" w:color="auto" w:fill="F8FAFC"/>
+          </w:tcPr>
+          <w:p>
+            <w:pPr>
+              <w:jc w:val="center"/>
+            </w:pPr>
+            <w:r>
+              <w:t>1.085 °C</w:t>
+            </w:r>
+          </w:p>
+        </w:tc>
+      </w:tr>
+      <w:tr>
+        <w:trPr>
+          <w:jc w:val="center"/>
+        </w:trPr>
+        <w:tc>
+          <w:tcPr>
+            <w:tcW w:w="2160" w:type="dxa"/>
+            <w:shd w:val="clear" w:color="auto" w:fill="FFFFFF"/>
+          </w:tcPr>
+          <w:p>
+            <w:r>
+              <w:rPr>
+                <w:b/>
+              </w:rPr>
+              <w:t>Hierro (puro)</w:t>
+            </w:r>
+          </w:p>
+        </w:tc>
+        <w:tc>
+          <w:tcPr>
+            <w:tcW w:w="2821" w:type="dxa"/>
+            <w:shd w:val="clear" w:color="auto" w:fill="FFFFFF"/>
+          </w:tcPr>
+          <w:p>
+            <w:pPr>
+              <w:jc w:val="center"/>
+              <w:rPr>
+                <w:u w:val="single"/>
+              </w:rPr>
+            </w:pPr>
+            <w:r>
+              <w:t>1.538 °C</w:t>
+            </w:r>
+          </w:p>
+        </w:tc>
+      </w:tr>
+    </w:tbl>
+    <w:p>
+      <w:pPr>
+        <w:pStyle w:val="Prrafodelista"/>
+        <w:spacing w:after="120"/>
+      </w:pPr>
+    </w:p>
+    <w:p>
+      <w:pPr>
+        <w:spacing w:after="120"/>
+      </w:pPr>
+      <w:r>
+        <w:t>S</w:t>
+      </w:r>
+      <w:r>
+        <w:t>us características lo hacen fundamental en industrias clave como la automotriz, construcción, envases, aeronáutica y la transmisión de energía.</w:t>
+      </w:r>
+    </w:p>
+    <w:p>
+      <w:r>
+        <w:br w:type="page"/>
+      </w:r>
+    </w:p>
+    <w:p>
+      <w:pPr>
+        <w:spacing w:after="120"/>
+      </w:pPr>
     </w:p>
     <w:p>
       <w:pPr>
@@ -1200,7 +1766,6 @@
           <w:b/>
           <w:color w:val="1B4965"/>
         </w:rPr>
-        <w:lastRenderedPageBreak/>
         <w:t xml:space="preserve">Importaciones: </w:t>
       </w:r>
       <w:r>
@@ -1218,6 +1783,7 @@
           <w:color w:val="1B4965"/>
           <w:sz w:val="26"/>
         </w:rPr>
+        <w:lastRenderedPageBreak/>
         <w:t>8. Comparación del Mercado Nacional e Internacional</w:t>
       </w:r>
     </w:p>
@@ -1608,7 +2174,7 @@
         </mc:Choice>
         <mc:Fallback>
           <w:pict>
-            <v:rect w14:anchorId="6093AB10" id="Rectángulo 247" o:spid="_x0000_s1026" style="position:absolute;margin-left:0;margin-top:0;width:579.9pt;height:750.3pt;z-index:251659264;visibility:visible;mso-wrap-style:square;mso-width-percent:950;mso-height-percent:950;mso-wrap-distance-left:9pt;mso-wrap-distance-top:0;mso-wrap-distance-right:9pt;mso-wrap-distance-bottom:0;mso-position-horizontal:center;mso-position-horizontal-relative:page;mso-position-vertical:center;mso-position-vertical-relative:page;mso-width-percent:950;mso-height-percent:950;mso-width-relative:page;mso-height-relative:page;v-text-anchor:middle" o:gfxdata="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" filled="f" strokecolor="#938953 [1614]" strokeweight="1.25pt">
+            <v:rect w14:anchorId="7960E4F7" id="Rectángulo 247" o:spid="_x0000_s1026" style="position:absolute;margin-left:0;margin-top:0;width:579.9pt;height:750.3pt;z-index:251659264;visibility:visible;mso-wrap-style:square;mso-width-percent:950;mso-height-percent:950;mso-wrap-distance-left:9pt;mso-wrap-distance-top:0;mso-wrap-distance-right:9pt;mso-wrap-distance-bottom:0;mso-position-horizontal:center;mso-position-horizontal-relative:page;mso-position-vertical:center;mso-position-vertical-relative:page;mso-width-percent:950;mso-height-percent:950;mso-width-relative:page;mso-height-relative:page;v-text-anchor:middle" o:gfxdata="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" filled="f" strokecolor="#938953 [1614]" strokeweight="1.25pt">
               <w10:wrap anchorx="page" anchory="page"/>
             </v:rect>
           </w:pict>
@@ -1877,6 +2443,119 @@
     </w:lvl>
   </w:abstractNum>
   <w:abstractNum w:abstractNumId="9" w15:restartNumberingAfterBreak="0">
+    <w:nsid w:val="3FDE6C22"/>
+    <w:multiLevelType w:val="hybridMultilevel"/>
+    <w:tmpl w:val="618A5438"/>
+    <w:lvl w:ilvl="0" w:tplc="2C0A0001">
+      <w:start w:val="1"/>
+      <w:numFmt w:val="bullet"/>
+      <w:lvlText w:val=""/>
+      <w:lvlJc w:val="left"/>
+      <w:pPr>
+        <w:ind w:left="720" w:hanging="360"/>
+      </w:pPr>
+      <w:rPr>
+        <w:rFonts w:ascii="Symbol" w:hAnsi="Symbol" w:hint="default"/>
+      </w:rPr>
+    </w:lvl>
+    <w:lvl w:ilvl="1" w:tplc="2C0A0003" w:tentative="1">
+      <w:start w:val="1"/>
+      <w:numFmt w:val="bullet"/>
+      <w:lvlText w:val="o"/>
+      <w:lvlJc w:val="left"/>
+      <w:pPr>
+        <w:ind w:left="1440" w:hanging="360"/>
+      </w:pPr>
+      <w:rPr>
+        <w:rFonts w:ascii="Courier New" w:hAnsi="Courier New" w:cs="Courier New" w:hint="default"/>
+      </w:rPr>
+    </w:lvl>
+    <w:lvl w:ilvl="2" w:tplc="2C0A0005" w:tentative="1">
+      <w:start w:val="1"/>
+      <w:numFmt w:val="bullet"/>
+      <w:lvlText w:val=""/>
+      <w:lvlJc w:val="left"/>
+      <w:pPr>
+        <w:ind w:left="2160" w:hanging="360"/>
+      </w:pPr>
+      <w:rPr>
+        <w:rFonts w:ascii="Wingdings" w:hAnsi="Wingdings" w:hint="default"/>
+      </w:rPr>
+    </w:lvl>
+    <w:lvl w:ilvl="3" w:tplc="2C0A0001" w:tentative="1">
+      <w:start w:val="1"/>
+      <w:numFmt w:val="bullet"/>
+      <w:lvlText w:val=""/>
+      <w:lvlJc w:val="left"/>
+      <w:pPr>
+        <w:ind w:left="2880" w:hanging="360"/>
+      </w:pPr>
+      <w:rPr>
+        <w:rFonts w:ascii="Symbol" w:hAnsi="Symbol" w:hint="default"/>
+      </w:rPr>
+    </w:lvl>
+    <w:lvl w:ilvl="4" w:tplc="2C0A0003" w:tentative="1">
+      <w:start w:val="1"/>
+      <w:numFmt w:val="bullet"/>
+      <w:lvlText w:val="o"/>
+      <w:lvlJc w:val="left"/>
+      <w:pPr>
+        <w:ind w:left="3600" w:hanging="360"/>
+      </w:pPr>
+      <w:rPr>
+        <w:rFonts w:ascii="Courier New" w:hAnsi="Courier New" w:cs="Courier New" w:hint="default"/>
+      </w:rPr>
+    </w:lvl>
+    <w:lvl w:ilvl="5" w:tplc="2C0A0005" w:tentative="1">
+      <w:start w:val="1"/>
+      <w:numFmt w:val="bullet"/>
+      <w:lvlText w:val=""/>
+      <w:lvlJc w:val="left"/>
+      <w:pPr>
+        <w:ind w:left="4320" w:hanging="360"/>
+      </w:pPr>
+      <w:rPr>
+        <w:rFonts w:ascii="Wingdings" w:hAnsi="Wingdings" w:hint="default"/>
+      </w:rPr>
+    </w:lvl>
+    <w:lvl w:ilvl="6" w:tplc="2C0A0001" w:tentative="1">
+      <w:start w:val="1"/>
+      <w:numFmt w:val="bullet"/>
+      <w:lvlText w:val=""/>
+      <w:lvlJc w:val="left"/>
+      <w:pPr>
+        <w:ind w:left="5040" w:hanging="360"/>
+      </w:pPr>
+      <w:rPr>
+        <w:rFonts w:ascii="Symbol" w:hAnsi="Symbol" w:hint="default"/>
+      </w:rPr>
+    </w:lvl>
+    <w:lvl w:ilvl="7" w:tplc="2C0A0003" w:tentative="1">
+      <w:start w:val="1"/>
+      <w:numFmt w:val="bullet"/>
+      <w:lvlText w:val="o"/>
+      <w:lvlJc w:val="left"/>
+      <w:pPr>
+        <w:ind w:left="5760" w:hanging="360"/>
+      </w:pPr>
+      <w:rPr>
+        <w:rFonts w:ascii="Courier New" w:hAnsi="Courier New" w:cs="Courier New" w:hint="default"/>
+      </w:rPr>
+    </w:lvl>
+    <w:lvl w:ilvl="8" w:tplc="2C0A0005" w:tentative="1">
+      <w:start w:val="1"/>
+      <w:numFmt w:val="bullet"/>
+      <w:lvlText w:val=""/>
+      <w:lvlJc w:val="left"/>
+      <w:pPr>
+        <w:ind w:left="6480" w:hanging="360"/>
+      </w:pPr>
+      <w:rPr>
+        <w:rFonts w:ascii="Wingdings" w:hAnsi="Wingdings" w:hint="default"/>
+      </w:rPr>
+    </w:lvl>
+  </w:abstractNum>
+  <w:abstractNum w:abstractNumId="10" w15:restartNumberingAfterBreak="0">
     <w:nsid w:val="5251424F"/>
     <w:multiLevelType w:val="hybridMultilevel"/>
     <w:tmpl w:val="20CEF662"/>
@@ -2017,6 +2696,9 @@
     <w:abstractNumId w:val="0"/>
   </w:num>
   <w:num w:numId="10" w16cid:durableId="1201356272">
+    <w:abstractNumId w:val="10"/>
+  </w:num>
+  <w:num w:numId="11" w16cid:durableId="1380861981">
     <w:abstractNumId w:val="9"/>
   </w:num>
 </w:numbering>
@@ -2411,7 +3093,7 @@
   <w:style w:type="paragraph" w:default="1" w:styleId="Normal">
     <w:name w:val="Normal"/>
     <w:qFormat/>
-    <w:rsid w:val="00FC693F"/>
+    <w:rsid w:val="00ED5BCA"/>
     <w:rPr>
       <w:rFonts w:ascii="Calibri" w:hAnsi="Calibri"/>
       <w:color w:val="282828"/>
@@ -13634,8 +14316,8 @@
     <w:rsidRoot w:val="007A79A0"/>
     <w:rsid w:val="00025DB8"/>
     <w:rsid w:val="00380F32"/>
+    <w:rsid w:val="00542ABF"/>
     <w:rsid w:val="007A79A0"/>
-    <w:rsid w:val="00BF008C"/>
     <w:rsid w:val="00FE7612"/>
     <w:rsid w:val="00FF20B2"/>
   </w:rsids>

</xml_diff>